<commit_message>
Fase 0: configuración, escenas, GameConfig, lista de assets y modelos
</commit_message>
<xml_diff>
--- a/Docs/Última Cinta — GDD y checklist de desarrollo.docx
+++ b/Docs/Última Cinta — GDD y checklist de desarrollo.docx
@@ -29,6 +29,7 @@
       <w:r>
         <w:rPr>
           <w:b/>
+          <w:bCs/>
         </w:rPr>
         <w:t xml:space="preserve">Pitch:</w:t>
       </w:r>
@@ -38,6 +39,7 @@
       <w:r>
         <w:rPr>
           <w:b/>
+          <w:bCs/>
         </w:rPr>
         <w:t xml:space="preserve">camcorder</w:t>
       </w:r>
@@ -47,6 +49,7 @@
       <w:r>
         <w:rPr>
           <w:b/>
+          <w:bCs/>
         </w:rPr>
         <w:t xml:space="preserve">antes del amanecer</w:t>
       </w:r>
@@ -59,6 +62,7 @@
       <w:r>
         <w:rPr>
           <w:b/>
+          <w:bCs/>
         </w:rPr>
         <w:t xml:space="preserve">Referencias:</w:t>
       </w:r>
@@ -71,6 +75,7 @@
       <w:r>
         <w:rPr>
           <w:b/>
+          <w:bCs/>
         </w:rPr>
         <w:t xml:space="preserve">Qué lo hace distinto:</w:t>
       </w:r>
@@ -116,6 +121,7 @@
       <w:r>
         <w:rPr>
           <w:b/>
+          <w:bCs/>
         </w:rPr>
         <w:t xml:space="preserve">Pilares:</w:t>
       </w:r>
@@ -173,6 +179,7 @@
       <w:r>
         <w:rPr>
           <w:b/>
+          <w:bCs/>
         </w:rPr>
         <w:t xml:space="preserve">Plataforma:</w:t>
       </w:r>
@@ -182,6 +189,7 @@
       <w:r>
         <w:rPr>
           <w:b/>
+          <w:bCs/>
         </w:rPr>
         <w:t xml:space="preserve">Jugadores:</w:t>
       </w:r>
@@ -191,6 +199,7 @@
       <w:r>
         <w:rPr>
           <w:b/>
+          <w:bCs/>
         </w:rPr>
         <w:t xml:space="preserve">Alcance de desarrollo:</w:t>
       </w:r>
@@ -220,6 +229,7 @@
       <w:r>
         <w:rPr>
           <w:b/>
+          <w:bCs/>
         </w:rPr>
         <w:t xml:space="preserve">una sola sesión de juego larga, de unas 2.5 a 3.5 horas</w:t>
       </w:r>
@@ -253,6 +263,7 @@
       <w:r>
         <w:rPr>
           <w:b/>
+          <w:bCs/>
         </w:rPr>
         <w:t xml:space="preserve">Unity 6 + Photon Fusion 2 (Shared Mode)</w:t>
       </w:r>
@@ -269,7 +280,7 @@
         </w:numPr>
       </w:pPr>
       <w:r>
-        <w:t xml:space="preserve">Arte tipo low-poly realista con iluminación fuerte; assets de la Unity Asset Store (revisa que la licencia permita usarlos en un juego publicado) y objetos sueltos generados con Hunyuan3D (velas, campana, muebles), sin modelado propio.</w:t>
+        <w:t xml:space="preserve">Arte tipo low-poly realista con iluminación fuerte; sin Unity Asset Store ni assets de terceros: los objetos (velas, campana, muebles, herramientas, fantasmas) los generamos nosotros con Hunyuan3D en hy.3d.tencent.ai, y las paredes y pisos de la casa se arman con formas básicas de Unity y ProBuilder.</w:t>
       </w:r>
     </w:p>
     <w:p>
@@ -281,7 +292,7 @@
         </w:numPr>
       </w:pPr>
       <w:r>
-        <w:t xml:space="preserve">Sin chat de voz en v1 (usan Discord). El chat de voz por proximidad queda como mejora.</w:t>
+        <w:t xml:space="preserve">Sin chat de voz en v1 (usan Discord). El chat de voz por proximidad queda como mejora. Los sonidos y la música sí pueden ser de terceros (por ejemplo de la Asset Store o de bibliotecas libres), siempre con una licencia que permita usarlos en un juego publicado. Los modelos 3D no: esos salen solo de Hunyuan3D.</w:t>
       </w:r>
     </w:p>
     <w:p>
@@ -300,6 +311,7 @@
       <w:r>
         <w:rPr>
           <w:b/>
+          <w:bCs/>
         </w:rPr>
         <w:t xml:space="preserve">2.7 minutos de juego por 1 minuto real</w:t>
       </w:r>
@@ -629,6 +641,7 @@
       <w:r>
         <w:rPr>
           <w:b/>
+          <w:bCs/>
         </w:rPr>
         <w:t xml:space="preserve">Siempre grabando:</w:t>
       </w:r>
@@ -647,6 +660,7 @@
       <w:r>
         <w:rPr>
           <w:b/>
+          <w:bCs/>
         </w:rPr>
         <w:t xml:space="preserve">Capa fantasma:</w:t>
       </w:r>
@@ -665,6 +679,7 @@
       <w:r>
         <w:rPr>
           <w:b/>
+          <w:bCs/>
         </w:rPr>
         <w:t xml:space="preserve">Visión nocturna (tecla N):</w:t>
       </w:r>
@@ -674,6 +689,7 @@
       <w:r>
         <w:rPr>
           <w:b/>
+          <w:bCs/>
         </w:rPr>
         <w:t xml:space="preserve">gasta batería 3 veces más rápido</w:t>
       </w:r>
@@ -692,6 +708,7 @@
       <w:r>
         <w:rPr>
           <w:b/>
+          <w:bCs/>
         </w:rPr>
         <w:t xml:space="preserve">Batería:</w:t>
       </w:r>
@@ -710,6 +727,7 @@
       <w:r>
         <w:rPr>
           <w:b/>
+          <w:bCs/>
         </w:rPr>
         <w:t xml:space="preserve">Cinta:</w:t>
       </w:r>
@@ -728,6 +746,7 @@
       <w:r>
         <w:rPr>
           <w:b/>
+          <w:bCs/>
         </w:rPr>
         <w:t xml:space="preserve">Zoom (rueda del ratón):</w:t>
       </w:r>
@@ -746,6 +765,7 @@
       <w:r>
         <w:rPr>
           <w:b/>
+          <w:bCs/>
         </w:rPr>
         <w:t xml:space="preserve">Interferencia:</w:t>
       </w:r>
@@ -764,6 +784,7 @@
       <w:r>
         <w:rPr>
           <w:b/>
+          <w:bCs/>
         </w:rPr>
         <w:t xml:space="preserve">Foto de evidencia (clic izquierdo):</w:t>
       </w:r>
@@ -790,6 +811,7 @@
       <w:r>
         <w:rPr>
           <w:b/>
+          <w:bCs/>
         </w:rPr>
         <w:t xml:space="preserve">Investigar:</w:t>
       </w:r>
@@ -808,6 +830,7 @@
       <w:r>
         <w:rPr>
           <w:b/>
+          <w:bCs/>
         </w:rPr>
         <w:t xml:space="preserve">Registrar:</w:t>
       </w:r>
@@ -826,6 +849,7 @@
       <w:r>
         <w:rPr>
           <w:b/>
+          <w:bCs/>
         </w:rPr>
         <w:t xml:space="preserve">Identificar:</w:t>
       </w:r>
@@ -844,6 +868,7 @@
       <w:r>
         <w:rPr>
           <w:b/>
+          <w:bCs/>
         </w:rPr>
         <w:t xml:space="preserve">Preparar:</w:t>
       </w:r>
@@ -862,6 +887,7 @@
       <w:r>
         <w:rPr>
           <w:b/>
+          <w:bCs/>
         </w:rPr>
         <w:t xml:space="preserve">Ritual:</w:t>
       </w:r>
@@ -880,6 +906,7 @@
       <w:r>
         <w:rPr>
           <w:b/>
+          <w:bCs/>
         </w:rPr>
         <w:t xml:space="preserve">Fin:</w:t>
       </w:r>
@@ -906,6 +933,7 @@
       <w:r>
         <w:rPr>
           <w:b/>
+          <w:bCs/>
         </w:rPr>
         <w:t xml:space="preserve">A. Aparición:</w:t>
       </w:r>
@@ -924,6 +952,7 @@
       <w:r>
         <w:rPr>
           <w:b/>
+          <w:bCs/>
         </w:rPr>
         <w:t xml:space="preserve">B. EMF 5:</w:t>
       </w:r>
@@ -942,6 +971,7 @@
       <w:r>
         <w:rPr>
           <w:b/>
+          <w:bCs/>
         </w:rPr>
         <w:t xml:space="preserve">C. Frío:</w:t>
       </w:r>
@@ -960,6 +990,7 @@
       <w:r>
         <w:rPr>
           <w:b/>
+          <w:bCs/>
         </w:rPr>
         <w:t xml:space="preserve">D. Escritura:</w:t>
       </w:r>
@@ -978,6 +1009,7 @@
       <w:r>
         <w:rPr>
           <w:b/>
+          <w:bCs/>
         </w:rPr>
         <w:t xml:space="preserve">E. Orbes:</w:t>
       </w:r>
@@ -1082,6 +1114,7 @@
             <w:r>
               <w:rPr>
                 <w:b/>
+                <w:bCs/>
               </w:rPr>
               <w:t xml:space="preserve">Ghoul</w:t>
             </w:r>
@@ -1110,6 +1143,7 @@
             <w:r>
               <w:rPr>
                 <w:b/>
+                <w:bCs/>
               </w:rPr>
               <w:t xml:space="preserve">sonido</w:t>
             </w:r>
@@ -1151,6 +1185,7 @@
             <w:r>
               <w:rPr>
                 <w:b/>
+                <w:bCs/>
               </w:rPr>
               <w:t xml:space="preserve">Vampiro</w:t>
             </w:r>
@@ -1179,6 +1214,7 @@
             <w:r>
               <w:rPr>
                 <w:b/>
+                <w:bCs/>
               </w:rPr>
               <w:t xml:space="preserve">oscuridad</w:t>
             </w:r>
@@ -1220,6 +1256,7 @@
             <w:r>
               <w:rPr>
                 <w:b/>
+                <w:bCs/>
               </w:rPr>
               <w:t xml:space="preserve">Poltergeist</w:t>
             </w:r>
@@ -1280,6 +1317,7 @@
             <w:r>
               <w:rPr>
                 <w:b/>
+                <w:bCs/>
               </w:rPr>
               <w:t xml:space="preserve">Espectro</w:t>
             </w:r>
@@ -1345,6 +1383,7 @@
       <w:r>
         <w:rPr>
           <w:b/>
+          <w:bCs/>
         </w:rPr>
         <w:t xml:space="preserve">3 evidencias</w:t>
       </w:r>
@@ -1366,6 +1405,7 @@
       <w:r>
         <w:rPr>
           <w:b/>
+          <w:bCs/>
         </w:rPr>
         <w:t xml:space="preserve">sala favorita</w:t>
       </w:r>
@@ -1375,6 +1415,7 @@
       <w:r>
         <w:rPr>
           <w:b/>
+          <w:bCs/>
         </w:rPr>
         <w:t xml:space="preserve">agresividad</w:t>
       </w:r>
@@ -1413,6 +1454,7 @@
       <w:r>
         <w:rPr>
           <w:b/>
+          <w:bCs/>
         </w:rPr>
         <w:t xml:space="preserve">Sótano:</w:t>
       </w:r>
@@ -1431,6 +1473,7 @@
       <w:r>
         <w:rPr>
           <w:b/>
+          <w:bCs/>
         </w:rPr>
         <w:t xml:space="preserve">Planta baja:</w:t>
       </w:r>
@@ -1449,6 +1492,7 @@
       <w:r>
         <w:rPr>
           <w:b/>
+          <w:bCs/>
         </w:rPr>
         <w:t xml:space="preserve">Primer piso:</w:t>
       </w:r>
@@ -1467,6 +1511,7 @@
       <w:r>
         <w:rPr>
           <w:b/>
+          <w:bCs/>
         </w:rPr>
         <w:t xml:space="preserve">Exterior:</w:t>
       </w:r>
@@ -1485,6 +1530,7 @@
       <w:r>
         <w:rPr>
           <w:b/>
+          <w:bCs/>
         </w:rPr>
         <w:t xml:space="preserve">Tamaño:</w:t>
       </w:r>
@@ -1503,6 +1549,7 @@
       <w:r>
         <w:rPr>
           <w:b/>
+          <w:bCs/>
         </w:rPr>
         <w:t xml:space="preserve">Puertas con llave:</w:t>
       </w:r>
@@ -1521,6 +1568,7 @@
       <w:r>
         <w:rPr>
           <w:b/>
+          <w:bCs/>
         </w:rPr>
         <w:t xml:space="preserve">Escondites:</w:t>
       </w:r>
@@ -1770,6 +1818,7 @@
       <w:r>
         <w:rPr>
           <w:b/>
+          <w:bCs/>
         </w:rPr>
         <w:t xml:space="preserve">Cordura (0–100):</w:t>
       </w:r>
@@ -1788,6 +1837,7 @@
       <w:r>
         <w:rPr>
           <w:b/>
+          <w:bCs/>
         </w:rPr>
         <w:t xml:space="preserve">Se recupera</w:t>
       </w:r>
@@ -1806,6 +1856,7 @@
       <w:r>
         <w:rPr>
           <w:b/>
+          <w:bCs/>
         </w:rPr>
         <w:t xml:space="preserve">Muerte:</w:t>
       </w:r>
@@ -1815,6 +1866,7 @@
       <w:r>
         <w:rPr>
           <w:b/>
+          <w:bCs/>
         </w:rPr>
         <w:t xml:space="preserve">parpadear luces</w:t>
       </w:r>
@@ -1833,6 +1885,7 @@
       <w:r>
         <w:rPr>
           <w:b/>
+          <w:bCs/>
         </w:rPr>
         <w:t xml:space="preserve">Derrota total:</w:t>
       </w:r>
@@ -1862,11 +1915,12 @@
       <w:r>
         <w:rPr>
           <w:b/>
+          <w:bCs/>
         </w:rPr>
         <w:t xml:space="preserve">Shared Mode de Photon Fusion 2</w:t>
       </w:r>
       <w:r>
-        <w:t xml:space="preserve"> (la sesión corre en la nube de Photon; el jugador que crea la sala controla al fantasma y el reloj, y esa autoridad pasa a otro jugador si él se va). Unity + Photon Fusion 2.</w:t>
+        <w:t xml:space="preserve"> (la sesión corre en la nube de Photon; el fantasma es un NPC que nadie juega; la computadora del jugador que crea la sala calcula su IA y el reloj y envía el resultado a los demás, y ese cálculo pasa a otro jugador si él se va). Unity + Photon Fusion 2.</w:t>
       </w:r>
     </w:p>
     <w:p>
@@ -1880,6 +1934,7 @@
       <w:r>
         <w:rPr>
           <w:b/>
+          <w:bCs/>
         </w:rPr>
         <w:t xml:space="preserve">Sesiones:</w:t>
       </w:r>
@@ -1898,11 +1953,12 @@
       <w:r>
         <w:rPr>
           <w:b/>
-        </w:rPr>
-        <w:t xml:space="preserve">Lo que controla solo el creador de la sala (State Authority):</w:t>
-      </w:r>
-      <w:r>
-        <w:t xml:space="preserve"> IA del fantasma (NavMesh), evidencias, reloj de la noche, sorteo del tipo de fantasma, estado del ritual.</w:t>
+          <w:bCs/>
+        </w:rPr>
+        <w:t xml:space="preserve">Lo que calcula solo la computadora del creador de la sala (State Authority) y envía a todos:</w:t>
+      </w:r>
+      <w:r>
+        <w:t xml:space="preserve"> IA del fantasma (NavMesh), evidencias, reloj de la noche, sorteo al azar del tipo de fantasma (se hace una sola vez, para que todos vean el mismo), estado del ritual.</w:t>
       </w:r>
     </w:p>
     <w:p>
@@ -1916,6 +1972,7 @@
       <w:r>
         <w:rPr>
           <w:b/>
+          <w:bCs/>
         </w:rPr>
         <w:t xml:space="preserve">Lo que se sincroniza:</w:t>
       </w:r>
@@ -1934,6 +1991,7 @@
       <w:r>
         <w:rPr>
           <w:b/>
+          <w:bCs/>
         </w:rPr>
         <w:t xml:space="preserve">La capa fantasma</w:t>
       </w:r>
@@ -1952,6 +2010,7 @@
       <w:r>
         <w:rPr>
           <w:b/>
+          <w:bCs/>
         </w:rPr>
         <w:t xml:space="preserve">Latencia objetivo:</w:t>
       </w:r>
@@ -1960,6 +2019,20 @@
       </w:r>
     </w:p>
     <w:p>
+      <w:pPr/>
+      <w:r>
+        <w:t xml:space="preserve">Documentación oficial: </w:t>
+      </w:r>
+      <w:hyperlink r:id="rId3" w:history="1">
+        <w:r>
+          <w:rPr>
+            <w:rStyle w:val="Hyperlink"/>
+          </w:rPr>
+          <w:t xml:space="preserve">Photon Fusion 2 Shared | Fusion Shared Introduction</w:t>
+        </w:r>
+      </w:hyperlink>
+    </w:p>
+    <w:p>
       <w:pPr>
         <w:pStyle w:val="Heading2"/>
       </w:pPr>
@@ -1978,6 +2051,7 @@
       <w:r>
         <w:rPr>
           <w:b/>
+          <w:bCs/>
         </w:rPr>
         <w:t xml:space="preserve">Look:</w:t>
       </w:r>
@@ -1996,11 +2070,12 @@
       <w:r>
         <w:rPr>
           <w:b/>
+          <w:bCs/>
         </w:rPr>
         <w:t xml:space="preserve">Audio:</w:t>
       </w:r>
       <w:r>
-        <w:t xml:space="preserve"> ambiente crujiente, pasos, latidos al subir el miedo. El audio 3D es clave. Sin música constante, solo un tema al empezar una cacería.</w:t>
+        <w:t xml:space="preserve"> ambiente crujiente, pasos, latidos al subir el miedo. El audio 3D es clave. Se pueden usar sonidos de terceros con licencia válida. Sin música constante, solo un tema al empezar una cacería.</w:t>
       </w:r>
     </w:p>
     <w:p>
@@ -2014,6 +2089,7 @@
       <w:r>
         <w:rPr>
           <w:b/>
+          <w:bCs/>
         </w:rPr>
         <w:t xml:space="preserve">UI mínima:</w:t>
       </w:r>
@@ -2032,6 +2108,7 @@
       <w:r>
         <w:rPr>
           <w:b/>
+          <w:bCs/>
         </w:rPr>
         <w:t xml:space="preserve">Accesibilidad básica:</w:t>
       </w:r>
@@ -2072,6 +2149,7 @@
       <w:r>
         <w:rPr>
           <w:b/>
+          <w:bCs/>
         </w:rPr>
         <w:t xml:space="preserve">El multijugador consume tiempo:</w:t>
       </w:r>
@@ -2090,6 +2168,7 @@
       <w:r>
         <w:rPr>
           <w:b/>
+          <w:bCs/>
         </w:rPr>
         <w:t xml:space="preserve">Duración difícil de ajustar:</w:t>
       </w:r>
@@ -2108,11 +2187,12 @@
       <w:r>
         <w:rPr>
           <w:b/>
+          <w:bCs/>
         </w:rPr>
         <w:t xml:space="preserve">Arte:</w:t>
       </w:r>
       <w:r>
-        <w:t xml:space="preserve"> usar paquetes de assets ya hechos y no modelar nada propio.</w:t>
+        <w:t xml:space="preserve"> generar los modelos con Hunyuan3D y mantener pocos objetos distintos (unos 40) para no atrasarse.</w:t>
       </w:r>
     </w:p>
     <w:p>
@@ -2126,6 +2206,7 @@
       <w:r>
         <w:rPr>
           <w:b/>
+          <w:bCs/>
         </w:rPr>
         <w:t xml:space="preserve">Codex hace cosas fuera de lo pedido:</w:t>
       </w:r>
@@ -2153,48 +2234,253 @@
         <w:pStyle w:val="Heading2"/>
       </w:pPr>
       <w:r>
-        <w:t xml:space="preserve">Instrucciones generales para Codex</w:t>
-      </w:r>
-    </w:p>
-    <w:p>
-      <w:pPr/>
-      <w:r>
-        <w:t xml:space="preserve">Copia este bloque al principio de la conversación con Codex:</w:t>
-      </w:r>
-    </w:p>
-    <w:p>
-      <w:pPr>
-        <w:pStyle w:val="Quote"/>
-      </w:pPr>
-      <w:r>
-        <w:t xml:space="preserve">Estamos haciendo «Última Cinta», un juego cooperativo de terror 3D en primera persona en </w:t>
-      </w:r>
-      <w:r>
-        <w:rPr>
-          <w:b/>
-        </w:rPr>
-        <w:t xml:space="preserve">Unity 6 con C# y Photon Fusion 2 en Shared Mode</w:t>
-      </w:r>
-      <w:r>
-        <w:t xml:space="preserve">. El jugador ve el mundo a través de una camcorder. Trabaja </w:t>
-      </w:r>
-      <w:r>
-        <w:rPr>
-          <w:b/>
-        </w:rPr>
-        <w:t xml:space="preserve">una fase a la vez</w:t>
-      </w:r>
-      <w:r>
-        <w:t xml:space="preserve">, no avances a la siguiente hasta que la actual funcione. Usa clases pequeñas y claras, ScriptableObjects para datos (fantasmas, evidencias, objetos), y un archivo </w:t>
+        <w:t xml:space="preserve">Fase 0 — Preparación (días 1–2)</w:t>
+      </w:r>
+    </w:p>
+    <w:p>
+      <w:pPr>
+        <w:pStyle w:val="ListParagraph"/>
+        <w:numPr>
+          <w:ilvl w:val="0"/>
+          <w:numId w:val="14"/>
+        </w:numPr>
+      </w:pPr>
+      <w:r>
+        <w:t xml:space="preserve">☐ Crear </w:t>
       </w:r>
       <w:r>
         <w:rPr>
           <w:rStyle w:val="CodeChar"/>
         </w:rPr>
+        <w:t xml:space="preserve">PROGRESS.md</w:t>
+      </w:r>
+      <w:r>
+        <w:t xml:space="preserve"> en la raíz del proyecto con toda esta checklist, y marcar </w:t>
+      </w:r>
+      <w:r>
+        <w:rPr>
+          <w:rStyle w:val="CodeChar"/>
+        </w:rPr>
+        <w:t xml:space="preserve">- [x]</w:t>
+      </w:r>
+      <w:r>
+        <w:t xml:space="preserve"> cada tarea al terminarla.</w:t>
+      </w:r>
+    </w:p>
+    <w:p>
+      <w:pPr>
+        <w:pStyle w:val="ListParagraph"/>
+        <w:numPr>
+          <w:ilvl w:val="0"/>
+          <w:numId w:val="15"/>
+        </w:numPr>
+      </w:pPr>
+      <w:r>
+        <w:t xml:space="preserve">☐ Crear proyecto Unity 6 con URP y Input System.</w:t>
+      </w:r>
+    </w:p>
+    <w:p>
+      <w:pPr>
+        <w:pStyle w:val="ListParagraph"/>
+        <w:numPr>
+          <w:ilvl w:val="0"/>
+          <w:numId w:val="15"/>
+        </w:numPr>
+      </w:pPr>
+      <w:r>
+        <w:t xml:space="preserve">☐ Instalar Photon Fusion 2, crear una app en el panel de Photon y activar el plan gratis (20 jugadores para desarrollo, 100 para publicar).</w:t>
+      </w:r>
+    </w:p>
+    <w:p>
+      <w:pPr>
+        <w:pStyle w:val="ListParagraph"/>
+        <w:numPr>
+          <w:ilvl w:val="0"/>
+          <w:numId w:val="15"/>
+        </w:numPr>
+      </w:pPr>
+      <w:r>
+        <w:t xml:space="preserve">☐ Estructura de carpetas: </w:t>
+      </w:r>
+      <w:r>
+        <w:rPr>
+          <w:rStyle w:val="CodeChar"/>
+        </w:rPr>
+        <w:t xml:space="preserve">Scripts/Player</w:t>
+      </w:r>
+      <w:r>
+        <w:t xml:space="preserve">, </w:t>
+      </w:r>
+      <w:r>
+        <w:rPr>
+          <w:rStyle w:val="CodeChar"/>
+        </w:rPr>
+        <w:t xml:space="preserve">Scripts/Ghost</w:t>
+      </w:r>
+      <w:r>
+        <w:t xml:space="preserve">, </w:t>
+      </w:r>
+      <w:r>
+        <w:rPr>
+          <w:rStyle w:val="CodeChar"/>
+        </w:rPr>
+        <w:t xml:space="preserve">Scripts/Network</w:t>
+      </w:r>
+      <w:r>
+        <w:t xml:space="preserve">, </w:t>
+      </w:r>
+      <w:r>
+        <w:rPr>
+          <w:rStyle w:val="CodeChar"/>
+        </w:rPr>
+        <w:t xml:space="preserve">Scripts/UI</w:t>
+      </w:r>
+      <w:r>
+        <w:t xml:space="preserve">, </w:t>
+      </w:r>
+      <w:r>
+        <w:rPr>
+          <w:rStyle w:val="CodeChar"/>
+        </w:rPr>
+        <w:t xml:space="preserve">Scripts/Data</w:t>
+      </w:r>
+      <w:r>
+        <w:t xml:space="preserve">, </w:t>
+      </w:r>
+      <w:r>
+        <w:rPr>
+          <w:rStyle w:val="CodeChar"/>
+        </w:rPr>
+        <w:t xml:space="preserve">Prefabs</w:t>
+      </w:r>
+      <w:r>
+        <w:t xml:space="preserve">, </w:t>
+      </w:r>
+      <w:r>
+        <w:rPr>
+          <w:rStyle w:val="CodeChar"/>
+        </w:rPr>
+        <w:t xml:space="preserve">Scenes</w:t>
+      </w:r>
+      <w:r>
+        <w:t xml:space="preserve">.</w:t>
+      </w:r>
+    </w:p>
+    <w:p>
+      <w:pPr>
+        <w:pStyle w:val="ListParagraph"/>
+        <w:numPr>
+          <w:ilvl w:val="0"/>
+          <w:numId w:val="15"/>
+        </w:numPr>
+      </w:pPr>
+      <w:r>
+        <w:t xml:space="preserve">☐ Crear </w:t>
+      </w:r>
+      <w:r>
+        <w:rPr>
+          <w:rStyle w:val="CodeChar"/>
+        </w:rPr>
         <w:t xml:space="preserve">GameConfig</w:t>
       </w:r>
       <w:r>
-        <w:t xml:space="preserve"> con todos los tiempos y valores de balance. El jugador que crea la sala tiene la autoridad (State Authority de Fusion) sobre el fantasma y el reloj. Después de cada tarea, explica qué archivos creaste y cómo probarlo. Al terminar cada fase, haz un commit. Usa solo la API de Fusion 2 de la documentación que te pegué y no inventes funciones.</w:t>
+        <w:t xml:space="preserve"> (ScriptableObject) con: duración real de la noche, velocidad del reloj, batería, cinta, cordura.</w:t>
+      </w:r>
+    </w:p>
+    <w:p>
+      <w:pPr>
+        <w:pStyle w:val="ListParagraph"/>
+        <w:numPr>
+          <w:ilvl w:val="0"/>
+          <w:numId w:val="15"/>
+        </w:numPr>
+      </w:pPr>
+      <w:r>
+        <w:t xml:space="preserve">☐ Escena </w:t>
+      </w:r>
+      <w:r>
+        <w:rPr>
+          <w:rStyle w:val="CodeChar"/>
+        </w:rPr>
+        <w:t xml:space="preserve">Bootstrap</w:t>
+      </w:r>
+      <w:r>
+        <w:t xml:space="preserve"> → </w:t>
+      </w:r>
+      <w:r>
+        <w:rPr>
+          <w:rStyle w:val="CodeChar"/>
+        </w:rPr>
+        <w:t xml:space="preserve">Lobby</w:t>
+      </w:r>
+      <w:r>
+        <w:t xml:space="preserve"> → </w:t>
+      </w:r>
+      <w:r>
+        <w:rPr>
+          <w:rStyle w:val="CodeChar"/>
+        </w:rPr>
+        <w:t xml:space="preserve">Mansion</w:t>
+      </w:r>
+      <w:r>
+        <w:t xml:space="preserve">.</w:t>
+      </w:r>
+    </w:p>
+    <w:p>
+      <w:pPr>
+        <w:pStyle w:val="ListParagraph"/>
+        <w:numPr>
+          <w:ilvl w:val="0"/>
+          <w:numId w:val="16"/>
+        </w:numPr>
+      </w:pPr>
+      <w:r>
+        <w:t xml:space="preserve">☐ Hacer la lista de assets que faltan (objetos, muebles, herramientas, fantasmas) con nombre y prioridad.</w:t>
+      </w:r>
+    </w:p>
+    <w:p>
+      <w:pPr>
+        <w:pStyle w:val="ListParagraph"/>
+        <w:numPr>
+          <w:ilvl w:val="0"/>
+          <w:numId w:val="16"/>
+        </w:numPr>
+      </w:pPr>
+      <w:r>
+        <w:t xml:space="preserve">☐ Generar cada asset con Hunyuan3D en hy.3d.tencent.ai y guardarlo en la carpeta </w:t>
+      </w:r>
+      <w:r>
+        <w:rPr>
+          <w:rStyle w:val="CodeChar"/>
+        </w:rPr>
+        <w:t xml:space="preserve">Assets/Generated/</w:t>
+      </w:r>
+      <w:r>
+        <w:t xml:space="preserve">.</w:t>
+      </w:r>
+    </w:p>
+    <w:p>
+      <w:pPr>
+        <w:pStyle w:val="ListParagraph"/>
+        <w:numPr>
+          <w:ilvl w:val="0"/>
+          <w:numId w:val="16"/>
+        </w:numPr>
+      </w:pPr>
+      <w:r>
+        <w:t xml:space="preserve">☐ Revisar los términos de uso de Hunyuan3D para juegos publicados antes de lanzar.</w:t>
+      </w:r>
+    </w:p>
+    <w:p>
+      <w:pPr>
+        <w:pStyle w:val="ListParagraph"/>
+        <w:numPr>
+          <w:ilvl w:val="0"/>
+          <w:numId w:val="16"/>
+        </w:numPr>
+      </w:pPr>
+      <w:r>
+        <w:t xml:space="preserve">☐ Importar cada modelo a Unity, ajustar escala, pivote y colisionadores, y guardarlo como prefab.</w:t>
       </w:r>
     </w:p>
     <w:p>
@@ -2202,166 +2488,772 @@
         <w:pStyle w:val="Heading2"/>
       </w:pPr>
       <w:r>
-        <w:t xml:space="preserve">Fase 0 — Preparación (días 1–2)</w:t>
-      </w:r>
-    </w:p>
-    <w:p>
-      <w:pPr>
-        <w:pStyle w:val="ListParagraph"/>
-        <w:numPr>
-          <w:ilvl w:val="0"/>
-          <w:numId w:val="14"/>
-        </w:numPr>
-      </w:pPr>
-      <w:r>
-        <w:t xml:space="preserve">☐ Crear proyecto Unity 6 con URP y Input System.</w:t>
-      </w:r>
-    </w:p>
-    <w:p>
-      <w:pPr>
-        <w:pStyle w:val="ListParagraph"/>
-        <w:numPr>
-          <w:ilvl w:val="0"/>
-          <w:numId w:val="14"/>
-        </w:numPr>
-      </w:pPr>
-      <w:r>
-        <w:t xml:space="preserve">☐ Instalar Photon Fusion 2, crear una app en el panel de Photon y activar el plan gratis (20 jugadores para desarrollo, 100 para publicar).</w:t>
-      </w:r>
-    </w:p>
-    <w:p>
-      <w:pPr>
-        <w:pStyle w:val="ListParagraph"/>
-        <w:numPr>
-          <w:ilvl w:val="0"/>
-          <w:numId w:val="14"/>
-        </w:numPr>
-      </w:pPr>
-      <w:r>
-        <w:t xml:space="preserve">☐ Estructura de carpetas: </w:t>
+        <w:t xml:space="preserve">Fase 1 — Jugador y camcorder en solitario (días 3–7)</w:t>
+      </w:r>
+    </w:p>
+    <w:p>
+      <w:pPr>
+        <w:pStyle w:val="ListParagraph"/>
+        <w:numPr>
+          <w:ilvl w:val="0"/>
+          <w:numId w:val="17"/>
+        </w:numPr>
+      </w:pPr>
+      <w:r>
+        <w:t xml:space="preserve">☐ Controlador en primera persona: caminar, correr (con stamina), agacharse, mirar con ratón.</w:t>
+      </w:r>
+    </w:p>
+    <w:p>
+      <w:pPr>
+        <w:pStyle w:val="ListParagraph"/>
+        <w:numPr>
+          <w:ilvl w:val="0"/>
+          <w:numId w:val="17"/>
+        </w:numPr>
+      </w:pPr>
+      <w:r>
+        <w:t xml:space="preserve">☐ Cámara del jugador con overlay de camcorder: luz REC parpadeante, tiempo, batería, cinta.</w:t>
+      </w:r>
+    </w:p>
+    <w:p>
+      <w:pPr>
+        <w:pStyle w:val="ListParagraph"/>
+        <w:numPr>
+          <w:ilvl w:val="0"/>
+          <w:numId w:val="17"/>
+        </w:numPr>
+      </w:pPr>
+      <w:r>
+        <w:t xml:space="preserve">☐ Postprocesado found footage: grano, viñeta, aberración cromática, ruido.</w:t>
+      </w:r>
+    </w:p>
+    <w:p>
+      <w:pPr>
+        <w:pStyle w:val="ListParagraph"/>
+        <w:numPr>
+          <w:ilvl w:val="0"/>
+          <w:numId w:val="17"/>
+        </w:numPr>
+      </w:pPr>
+      <w:r>
+        <w:t xml:space="preserve">☐ Visión nocturna (tecla N) con consumo de batería 3×.</w:t>
+      </w:r>
+    </w:p>
+    <w:p>
+      <w:pPr>
+        <w:pStyle w:val="ListParagraph"/>
+        <w:numPr>
+          <w:ilvl w:val="0"/>
+          <w:numId w:val="17"/>
+        </w:numPr>
+      </w:pPr>
+      <w:r>
+        <w:t xml:space="preserve">☐ Zoom con la rueda del ratón.</w:t>
+      </w:r>
+    </w:p>
+    <w:p>
+      <w:pPr>
+        <w:pStyle w:val="ListParagraph"/>
+        <w:numPr>
+          <w:ilvl w:val="0"/>
+          <w:numId w:val="17"/>
+        </w:numPr>
+      </w:pPr>
+      <w:r>
+        <w:t xml:space="preserve">☐ Batería y cinta que se agotan, con avisos y apagado de la cámara a 0.</w:t>
+      </w:r>
+    </w:p>
+    <w:p>
+      <w:pPr>
+        <w:pStyle w:val="ListParagraph"/>
+        <w:numPr>
+          <w:ilvl w:val="0"/>
+          <w:numId w:val="17"/>
+        </w:numPr>
+      </w:pPr>
+      <w:r>
+        <w:t xml:space="preserve">☐ Linterna independiente de la cámara.</w:t>
+      </w:r>
+    </w:p>
+    <w:p>
+      <w:pPr>
+        <w:pStyle w:val="ListParagraph"/>
+        <w:numPr>
+          <w:ilvl w:val="0"/>
+          <w:numId w:val="17"/>
+        </w:numPr>
+      </w:pPr>
+      <w:r>
+        <w:t xml:space="preserve">☐ Sistema de interacción (tecla E): abrir puertas, recoger objetos, usar interruptores.</w:t>
+      </w:r>
+    </w:p>
+    <w:p>
+      <w:pPr>
+        <w:pStyle w:val="ListParagraph"/>
+        <w:numPr>
+          <w:ilvl w:val="0"/>
+          <w:numId w:val="17"/>
+        </w:numPr>
+      </w:pPr>
+      <w:r>
+        <w:t xml:space="preserve">☐ Inventario simple de 3 ranuras más camcorder.</w:t>
+      </w:r>
+    </w:p>
+    <w:p>
+      <w:pPr>
+        <w:pStyle w:val="ListParagraph"/>
+        <w:numPr>
+          <w:ilvl w:val="0"/>
+          <w:numId w:val="17"/>
+        </w:numPr>
+      </w:pPr>
+      <w:r>
+        <w:t xml:space="preserve">☐ Capa «Ghost» visible solo para la cámara del jugador (culling mask). Probar con un cubo de prueba.</w:t>
+      </w:r>
+    </w:p>
+    <w:p>
+      <w:pPr>
+        <w:pStyle w:val="ListParagraph"/>
+        <w:numPr>
+          <w:ilvl w:val="0"/>
+          <w:numId w:val="17"/>
+        </w:numPr>
+      </w:pPr>
+      <w:r>
+        <w:t xml:space="preserve">☐ </w:t>
+      </w:r>
+      <w:r>
+        <w:rPr>
+          <w:b/>
+          <w:bCs/>
+        </w:rPr>
+        <w:t xml:space="preserve">Prueba:</w:t>
+      </w:r>
+      <w:r>
+        <w:t xml:space="preserve"> recorrer una sala de prueba, ver el cubo solo por la cámara, gastar batería y cinta.</w:t>
+      </w:r>
+    </w:p>
+    <w:p>
+      <w:pPr>
+        <w:pStyle w:val="Heading2"/>
+      </w:pPr>
+      <w:r>
+        <w:t xml:space="preserve">Fase 2 — Mansión (días 6–12)</w:t>
+      </w:r>
+    </w:p>
+    <w:p>
+      <w:pPr>
+        <w:pStyle w:val="ListParagraph"/>
+        <w:numPr>
+          <w:ilvl w:val="0"/>
+          <w:numId w:val="18"/>
+        </w:numPr>
+      </w:pPr>
+      <w:r>
+        <w:t xml:space="preserve">☐ Construir la mansión por bloques (modular) con paredes y pisos hechos con formas básicas de Unity (ProBuilder) y todos los objetos generados con Hunyuan3D: sótano, planta baja, primer piso, exterior con la camioneta.</w:t>
+      </w:r>
+    </w:p>
+    <w:p>
+      <w:pPr>
+        <w:pStyle w:val="ListParagraph"/>
+        <w:numPr>
+          <w:ilvl w:val="0"/>
+          <w:numId w:val="18"/>
+        </w:numPr>
+      </w:pPr>
+      <w:r>
+        <w:t xml:space="preserve">☐ Iluminación baja, luces que se pueden encender/apagar, generador en el sótano.</w:t>
+      </w:r>
+    </w:p>
+    <w:p>
+      <w:pPr>
+        <w:pStyle w:val="ListParagraph"/>
+        <w:numPr>
+          <w:ilvl w:val="0"/>
+          <w:numId w:val="18"/>
+        </w:numPr>
+      </w:pPr>
+      <w:r>
+        <w:t xml:space="preserve">☐ Puertas con llave y sistema de llaves que desbloquea áreas (en la Fase 4 se enlaza con los actos).</w:t>
+      </w:r>
+    </w:p>
+    <w:p>
+      <w:pPr>
+        <w:pStyle w:val="ListParagraph"/>
+        <w:numPr>
+          <w:ilvl w:val="0"/>
+          <w:numId w:val="18"/>
+        </w:numPr>
+      </w:pPr>
+      <w:r>
+        <w:t xml:space="preserve">☐ Escondites (armarios y camas) que el jugador puede usar.</w:t>
+      </w:r>
+    </w:p>
+    <w:p>
+      <w:pPr>
+        <w:pStyle w:val="ListParagraph"/>
+        <w:numPr>
+          <w:ilvl w:val="0"/>
+          <w:numId w:val="18"/>
+        </w:numPr>
+      </w:pPr>
+      <w:r>
+        <w:t xml:space="preserve">☐ Bake de NavMesh en toda la casa.</w:t>
+      </w:r>
+    </w:p>
+    <w:p>
+      <w:pPr>
+        <w:pStyle w:val="ListParagraph"/>
+        <w:numPr>
+          <w:ilvl w:val="0"/>
+          <w:numId w:val="18"/>
+        </w:numPr>
+      </w:pPr>
+      <w:r>
+        <w:t xml:space="preserve">☐ Puntos de interés marcados: sala favorita candidata, puntos de objeto de ritual, puntos de evidencia.</w:t>
+      </w:r>
+    </w:p>
+    <w:p>
+      <w:pPr>
+        <w:pStyle w:val="ListParagraph"/>
+        <w:numPr>
+          <w:ilvl w:val="0"/>
+          <w:numId w:val="18"/>
+        </w:numPr>
+      </w:pPr>
+      <w:r>
+        <w:t xml:space="preserve">☐ </w:t>
+      </w:r>
+      <w:r>
+        <w:rPr>
+          <w:b/>
+          <w:bCs/>
+        </w:rPr>
+        <w:t xml:space="preserve">Prueba:</w:t>
+      </w:r>
+      <w:r>
+        <w:t xml:space="preserve"> recorrer toda la casa, que las puertas y llaves funcionen, que el NavMesh cubra todo.</w:t>
+      </w:r>
+    </w:p>
+    <w:p>
+      <w:pPr>
+        <w:pStyle w:val="Heading2"/>
+      </w:pPr>
+      <w:r>
+        <w:t xml:space="preserve">Fase 3 — Fantasma, evidencias y diario (días 10–17)</w:t>
+      </w:r>
+    </w:p>
+    <w:p>
+      <w:pPr>
+        <w:pStyle w:val="ListParagraph"/>
+        <w:numPr>
+          <w:ilvl w:val="0"/>
+          <w:numId w:val="19"/>
+        </w:numPr>
+      </w:pPr>
+      <w:r>
+        <w:t xml:space="preserve">☐ ScriptableObject </w:t>
       </w:r>
       <w:r>
         <w:rPr>
           <w:rStyle w:val="CodeChar"/>
         </w:rPr>
-        <w:t xml:space="preserve">Scripts/Player</w:t>
-      </w:r>
-      <w:r>
-        <w:t xml:space="preserve">, </w:t>
+        <w:t xml:space="preserve">GhostType</w:t>
+      </w:r>
+      <w:r>
+        <w:t xml:space="preserve"> con: nombre, evidencias, velocidad, comportamiento, objetos de ritual.</w:t>
+      </w:r>
+    </w:p>
+    <w:p>
+      <w:pPr>
+        <w:pStyle w:val="ListParagraph"/>
+        <w:numPr>
+          <w:ilvl w:val="0"/>
+          <w:numId w:val="19"/>
+        </w:numPr>
+      </w:pPr>
+      <w:r>
+        <w:t xml:space="preserve">☐ Crear los 4 fantasmas: Ghoul, Vampiro, Poltergeist, Espectro (modelos generados con Hunyuan3D; si salen sin esqueleto, se animan por código: flotar, arrastrarse, parpadear).</w:t>
+      </w:r>
+    </w:p>
+    <w:p>
+      <w:pPr>
+        <w:pStyle w:val="ListParagraph"/>
+        <w:numPr>
+          <w:ilvl w:val="0"/>
+          <w:numId w:val="19"/>
+        </w:numPr>
+      </w:pPr>
+      <w:r>
+        <w:t xml:space="preserve">☐ IA base con estados: Deambular, Actividad, Cacería, Descanso.</w:t>
+      </w:r>
+    </w:p>
+    <w:p>
+      <w:pPr>
+        <w:pStyle w:val="ListParagraph"/>
+        <w:numPr>
+          <w:ilvl w:val="0"/>
+          <w:numId w:val="19"/>
+        </w:numPr>
+      </w:pPr>
+      <w:r>
+        <w:t xml:space="preserve">☐ Elegir tipo de fantasma, sala favorita y agresividad al iniciar la partida.</w:t>
+      </w:r>
+    </w:p>
+    <w:p>
+      <w:pPr>
+        <w:pStyle w:val="ListParagraph"/>
+        <w:numPr>
+          <w:ilvl w:val="0"/>
+          <w:numId w:val="19"/>
+        </w:numPr>
+      </w:pPr>
+      <w:r>
+        <w:t xml:space="preserve">☐ Comportamientos propios: Ghoul (oído), Vampiro (oscuridad y batería), Poltergeist (objetos), Espectro (paredes y teletransporte).</w:t>
+      </w:r>
+    </w:p>
+    <w:p>
+      <w:pPr>
+        <w:pStyle w:val="ListParagraph"/>
+        <w:numPr>
+          <w:ilvl w:val="0"/>
+          <w:numId w:val="19"/>
+        </w:numPr>
+      </w:pPr>
+      <w:r>
+        <w:t xml:space="preserve">☐ Interferencia en la cámara según distancia al fantasma.</w:t>
+      </w:r>
+    </w:p>
+    <w:p>
+      <w:pPr>
+        <w:pStyle w:val="ListParagraph"/>
+        <w:numPr>
+          <w:ilvl w:val="0"/>
+          <w:numId w:val="19"/>
+        </w:numPr>
+      </w:pPr>
+      <w:r>
+        <w:t xml:space="preserve">☐ Sistema de cacería: 45–90 s, luces que se apagan, estática en la cámara, jugador atrapado muere.</w:t>
+      </w:r>
+    </w:p>
+    <w:p>
+      <w:pPr>
+        <w:pStyle w:val="ListParagraph"/>
+        <w:numPr>
+          <w:ilvl w:val="0"/>
+          <w:numId w:val="19"/>
+        </w:numPr>
+      </w:pPr>
+      <w:r>
+        <w:t xml:space="preserve">☐ Las 5 evidencias: aparición, EMF, termómetro, libro de escritura, orbes.</w:t>
+      </w:r>
+    </w:p>
+    <w:p>
+      <w:pPr>
+        <w:pStyle w:val="ListParagraph"/>
+        <w:numPr>
+          <w:ilvl w:val="0"/>
+          <w:numId w:val="19"/>
+        </w:numPr>
+      </w:pPr>
+      <w:r>
+        <w:t xml:space="preserve">☐ Diario: marcar evidencias, filtrar fantasmas posibles, elegir uno (en local; se comparte en red en la Fase 5).</w:t>
+      </w:r>
+    </w:p>
+    <w:p>
+      <w:pPr>
+        <w:pStyle w:val="ListParagraph"/>
+        <w:numPr>
+          <w:ilvl w:val="0"/>
+          <w:numId w:val="19"/>
+        </w:numPr>
+      </w:pPr>
+      <w:r>
+        <w:t xml:space="preserve">☐ Sistema de cordura con alucinaciones.</w:t>
+      </w:r>
+    </w:p>
+    <w:p>
+      <w:pPr>
+        <w:pStyle w:val="ListParagraph"/>
+        <w:numPr>
+          <w:ilvl w:val="0"/>
+          <w:numId w:val="19"/>
+        </w:numPr>
+      </w:pPr>
+      <w:r>
+        <w:t xml:space="preserve">☐ Modo espectador al morir, con parpadeo de luces.</w:t>
+      </w:r>
+    </w:p>
+    <w:p>
+      <w:pPr>
+        <w:pStyle w:val="ListParagraph"/>
+        <w:numPr>
+          <w:ilvl w:val="0"/>
+          <w:numId w:val="19"/>
+        </w:numPr>
+      </w:pPr>
+      <w:r>
+        <w:t xml:space="preserve">☐ </w:t>
+      </w:r>
+      <w:r>
+        <w:rPr>
+          <w:b/>
+          <w:bCs/>
+        </w:rPr>
+        <w:t xml:space="preserve">Prueba:</w:t>
+      </w:r>
+      <w:r>
+        <w:t xml:space="preserve"> forzar cada tipo de fantasma, confirmar que las evidencias coinciden con la tabla del GDD.</w:t>
+      </w:r>
+    </w:p>
+    <w:p>
+      <w:pPr>
+        <w:pStyle w:val="Heading2"/>
+      </w:pPr>
+      <w:r>
+        <w:t xml:space="preserve">Fase 4 — Reloj y ritual (días 15–20)</w:t>
+      </w:r>
+    </w:p>
+    <w:p>
+      <w:pPr>
+        <w:pStyle w:val="ListParagraph"/>
+        <w:numPr>
+          <w:ilvl w:val="0"/>
+          <w:numId w:val="20"/>
+        </w:numPr>
+      </w:pPr>
+      <w:r>
+        <w:t xml:space="preserve">☐ Reloj de la noche (22:00–06:00) configurable desde </w:t>
       </w:r>
       <w:r>
         <w:rPr>
           <w:rStyle w:val="CodeChar"/>
         </w:rPr>
-        <w:t xml:space="preserve">Scripts/Ghost</w:t>
-      </w:r>
-      <w:r>
-        <w:t xml:space="preserve">, </w:t>
+        <w:t xml:space="preserve">GameConfig</w:t>
+      </w:r>
+      <w:r>
+        <w:t xml:space="preserve">.</w:t>
+      </w:r>
+    </w:p>
+    <w:p>
+      <w:pPr>
+        <w:pStyle w:val="ListParagraph"/>
+        <w:numPr>
+          <w:ilvl w:val="0"/>
+          <w:numId w:val="20"/>
+        </w:numPr>
+      </w:pPr>
+      <w:r>
+        <w:t xml:space="preserve">☐ Cambio de actos según la hora, con desbloqueo de áreas.</w:t>
+      </w:r>
+    </w:p>
+    <w:p>
+      <w:pPr>
+        <w:pStyle w:val="ListParagraph"/>
+        <w:numPr>
+          <w:ilvl w:val="0"/>
+          <w:numId w:val="20"/>
+        </w:numPr>
+      </w:pPr>
+      <w:r>
+        <w:t xml:space="preserve">☐ Objetos de ritual (3 por tipo de fantasma) colocados al azar en puntos válidos.</w:t>
+      </w:r>
+    </w:p>
+    <w:p>
+      <w:pPr>
+        <w:pStyle w:val="ListParagraph"/>
+        <w:numPr>
+          <w:ilvl w:val="0"/>
+          <w:numId w:val="20"/>
+        </w:numPr>
+      </w:pPr>
+      <w:r>
+        <w:t xml:space="preserve">☐ Sala del ritual con el círculo: colocar objetos, encender velas.</w:t>
+      </w:r>
+    </w:p>
+    <w:p>
+      <w:pPr>
+        <w:pStyle w:val="ListParagraph"/>
+        <w:numPr>
+          <w:ilvl w:val="0"/>
+          <w:numId w:val="20"/>
+        </w:numPr>
+      </w:pPr>
+      <w:r>
+        <w:t xml:space="preserve">☐ Ritual en 3 oleadas con cacerías cada vez más fuertes.</w:t>
+      </w:r>
+    </w:p>
+    <w:p>
+      <w:pPr>
+        <w:pStyle w:val="ListParagraph"/>
+        <w:numPr>
+          <w:ilvl w:val="0"/>
+          <w:numId w:val="20"/>
+        </w:numPr>
+      </w:pPr>
+      <w:r>
+        <w:t xml:space="preserve">☐ Si el diario fue correcto: expulsión y victoria. Si no: el ritual falla y el fantasma se enfurece.</w:t>
+      </w:r>
+    </w:p>
+    <w:p>
+      <w:pPr>
+        <w:pStyle w:val="ListParagraph"/>
+        <w:numPr>
+          <w:ilvl w:val="0"/>
+          <w:numId w:val="20"/>
+        </w:numPr>
+      </w:pPr>
+      <w:r>
+        <w:t xml:space="preserve">☐ Pantallas de victoria, derrota por amanecer y derrota por muerte total.</w:t>
+      </w:r>
+    </w:p>
+    <w:p>
+      <w:pPr>
+        <w:pStyle w:val="ListParagraph"/>
+        <w:numPr>
+          <w:ilvl w:val="0"/>
+          <w:numId w:val="20"/>
+        </w:numPr>
+      </w:pPr>
+      <w:r>
+        <w:t xml:space="preserve">☐ </w:t>
+      </w:r>
+      <w:r>
+        <w:rPr>
+          <w:b/>
+          <w:bCs/>
+        </w:rPr>
+        <w:t xml:space="preserve">Prueba:</w:t>
+      </w:r>
+      <w:r>
+        <w:t xml:space="preserve"> una partida completa solo, de principio a fin, con el reloj acelerado.</w:t>
+      </w:r>
+    </w:p>
+    <w:p>
+      <w:pPr>
+        <w:pStyle w:val="Heading2"/>
+      </w:pPr>
+      <w:r>
+        <w:t xml:space="preserve">Fase 5 — Multijugador (días 18–25)</w:t>
+      </w:r>
+    </w:p>
+    <w:p>
+      <w:pPr>
+        <w:pStyle w:val="ListParagraph"/>
+        <w:numPr>
+          <w:ilvl w:val="0"/>
+          <w:numId w:val="21"/>
+        </w:numPr>
+      </w:pPr>
+      <w:r>
+        <w:t xml:space="preserve">☐ Pantalla de lobby: crear sala con un nombre y unirse por nombre de sala.</w:t>
+      </w:r>
+    </w:p>
+    <w:p>
+      <w:pPr>
+        <w:pStyle w:val="ListParagraph"/>
+        <w:numPr>
+          <w:ilvl w:val="0"/>
+          <w:numId w:val="21"/>
+        </w:numPr>
+      </w:pPr>
+      <w:r>
+        <w:t xml:space="preserve">☐ Conexión con Photon Fusion 2 en Shared Mode; spawn de hasta 4 jugadores.</w:t>
+      </w:r>
+    </w:p>
+    <w:p>
+      <w:pPr>
+        <w:pStyle w:val="ListParagraph"/>
+        <w:numPr>
+          <w:ilvl w:val="0"/>
+          <w:numId w:val="21"/>
+        </w:numPr>
+      </w:pPr>
+      <w:r>
+        <w:t xml:space="preserve">☐ Sincronizar jugadores: posición, animación, linterna, estado de cámara.</w:t>
+      </w:r>
+    </w:p>
+    <w:p>
+      <w:pPr>
+        <w:pStyle w:val="ListParagraph"/>
+        <w:numPr>
+          <w:ilvl w:val="0"/>
+          <w:numId w:val="21"/>
+        </w:numPr>
+      </w:pPr>
+      <w:r>
+        <w:t xml:space="preserve">☐ Hacer que la computadora del creador de la sala calcule la IA del fantasma y el reloj (los demás reciben el resultado), y pasar ese cálculo a otro jugador si se desconecta.</w:t>
+      </w:r>
+    </w:p>
+    <w:p>
+      <w:pPr>
+        <w:pStyle w:val="ListParagraph"/>
+        <w:numPr>
+          <w:ilvl w:val="0"/>
+          <w:numId w:val="21"/>
+        </w:numPr>
+      </w:pPr>
+      <w:r>
+        <w:t xml:space="preserve">☐ Sincronizar puertas, luces, objetos recogidos, evidencias y diario.</w:t>
+      </w:r>
+    </w:p>
+    <w:p>
+      <w:pPr>
+        <w:pStyle w:val="ListParagraph"/>
+        <w:numPr>
+          <w:ilvl w:val="0"/>
+          <w:numId w:val="21"/>
+        </w:numPr>
+      </w:pPr>
+      <w:r>
+        <w:t xml:space="preserve">☐ Capa fantasma local por jugador según su cámara.</w:t>
+      </w:r>
+    </w:p>
+    <w:p>
+      <w:pPr>
+        <w:pStyle w:val="ListParagraph"/>
+        <w:numPr>
+          <w:ilvl w:val="0"/>
+          <w:numId w:val="21"/>
+        </w:numPr>
+      </w:pPr>
+      <w:r>
+        <w:t xml:space="preserve">☐ Manejo de desconexiones: el fantasma sigue y el jugador queda como muerto.</w:t>
+      </w:r>
+    </w:p>
+    <w:p>
+      <w:pPr>
+        <w:pStyle w:val="ListParagraph"/>
+        <w:numPr>
+          <w:ilvl w:val="0"/>
+          <w:numId w:val="21"/>
+        </w:numPr>
+      </w:pPr>
+      <w:r>
+        <w:t xml:space="preserve">☐ Bloquear el diario para que cualquiera pueda marcar pero se actualice para todos.</w:t>
+      </w:r>
+    </w:p>
+    <w:p>
+      <w:pPr>
+        <w:pStyle w:val="ListParagraph"/>
+        <w:numPr>
+          <w:ilvl w:val="0"/>
+          <w:numId w:val="21"/>
+        </w:numPr>
+      </w:pPr>
+      <w:r>
+        <w:t xml:space="preserve">☐ </w:t>
+      </w:r>
+      <w:r>
+        <w:rPr>
+          <w:b/>
+          <w:bCs/>
+        </w:rPr>
+        <w:t xml:space="preserve">Prueba:</w:t>
+      </w:r>
+      <w:r>
+        <w:t xml:space="preserve"> dos instancias en la misma PC, luego dos PCs distintas con Photon.</w:t>
+      </w:r>
+    </w:p>
+    <w:p>
+      <w:pPr>
+        <w:pStyle w:val="Heading2"/>
+      </w:pPr>
+      <w:r>
+        <w:t xml:space="preserve">Fase 6 — Audio, pulido y balance (días 24–29)</w:t>
+      </w:r>
+    </w:p>
+    <w:p>
+      <w:pPr>
+        <w:pStyle w:val="ListParagraph"/>
+        <w:numPr>
+          <w:ilvl w:val="0"/>
+          <w:numId w:val="22"/>
+        </w:numPr>
+      </w:pPr>
+      <w:r>
+        <w:t xml:space="preserve">☐ Audio 3D: pasos, puertas, voz del fantasma, latidos según miedo (sonidos de terceros permitidos; guardar la licencia de cada uno).</w:t>
+      </w:r>
+    </w:p>
+    <w:p>
+      <w:pPr>
+        <w:pStyle w:val="ListParagraph"/>
+        <w:numPr>
+          <w:ilvl w:val="0"/>
+          <w:numId w:val="22"/>
+        </w:numPr>
+      </w:pPr>
+      <w:r>
+        <w:t xml:space="preserve">☐ Sonido distinto por cada fantasma y por cada fase de cacería.</w:t>
+      </w:r>
+    </w:p>
+    <w:p>
+      <w:pPr>
+        <w:pStyle w:val="ListParagraph"/>
+        <w:numPr>
+          <w:ilvl w:val="0"/>
+          <w:numId w:val="22"/>
+        </w:numPr>
+      </w:pPr>
+      <w:r>
+        <w:t xml:space="preserve">☐ Efectos visuales de la cámara según la interferencia.</w:t>
+      </w:r>
+    </w:p>
+    <w:p>
+      <w:pPr>
+        <w:pStyle w:val="ListParagraph"/>
+        <w:numPr>
+          <w:ilvl w:val="0"/>
+          <w:numId w:val="22"/>
+        </w:numPr>
+      </w:pPr>
+      <w:r>
+        <w:t xml:space="preserve">☐ Menú principal, pausa y ajustes (volumen, sensibilidad, subtítulos).</w:t>
+      </w:r>
+    </w:p>
+    <w:p>
+      <w:pPr>
+        <w:pStyle w:val="ListParagraph"/>
+        <w:numPr>
+          <w:ilvl w:val="0"/>
+          <w:numId w:val="22"/>
+        </w:numPr>
+      </w:pPr>
+      <w:r>
+        <w:t xml:space="preserve">☐ Tutorial corto en la camioneta: cómo usar cámara, diario y herramientas.</w:t>
+      </w:r>
+    </w:p>
+    <w:p>
+      <w:pPr>
+        <w:pStyle w:val="ListParagraph"/>
+        <w:numPr>
+          <w:ilvl w:val="0"/>
+          <w:numId w:val="22"/>
+        </w:numPr>
+      </w:pPr>
+      <w:r>
+        <w:t xml:space="preserve">☐ Pasada de balance: probar 5 partidas completas y ajustar </w:t>
       </w:r>
       <w:r>
         <w:rPr>
           <w:rStyle w:val="CodeChar"/>
         </w:rPr>
-        <w:t xml:space="preserve">Scripts/Network</w:t>
-      </w:r>
-      <w:r>
-        <w:t xml:space="preserve">, </w:t>
-      </w:r>
-      <w:r>
-        <w:rPr>
-          <w:rStyle w:val="CodeChar"/>
-        </w:rPr>
-        <w:t xml:space="preserve">Scripts/UI</w:t>
-      </w:r>
-      <w:r>
-        <w:t xml:space="preserve">, </w:t>
-      </w:r>
-      <w:r>
-        <w:rPr>
-          <w:rStyle w:val="CodeChar"/>
-        </w:rPr>
-        <w:t xml:space="preserve">Scripts/Data</w:t>
-      </w:r>
-      <w:r>
-        <w:t xml:space="preserve">, </w:t>
-      </w:r>
-      <w:r>
-        <w:rPr>
-          <w:rStyle w:val="CodeChar"/>
-        </w:rPr>
-        <w:t xml:space="preserve">Prefabs</w:t>
-      </w:r>
-      <w:r>
-        <w:t xml:space="preserve">, </w:t>
-      </w:r>
-      <w:r>
-        <w:rPr>
-          <w:rStyle w:val="CodeChar"/>
-        </w:rPr>
-        <w:t xml:space="preserve">Scenes</w:t>
-      </w:r>
-      <w:r>
-        <w:t xml:space="preserve">.</w:t>
-      </w:r>
-    </w:p>
-    <w:p>
-      <w:pPr>
-        <w:pStyle w:val="ListParagraph"/>
-        <w:numPr>
-          <w:ilvl w:val="0"/>
-          <w:numId w:val="14"/>
-        </w:numPr>
-      </w:pPr>
-      <w:r>
-        <w:t xml:space="preserve">☐ Crear </w:t>
-      </w:r>
-      <w:r>
-        <w:rPr>
-          <w:rStyle w:val="CodeChar"/>
-        </w:rPr>
         <w:t xml:space="preserve">GameConfig</w:t>
       </w:r>
       <w:r>
-        <w:t xml:space="preserve"> (ScriptableObject) con: duración real de la noche, velocidad del reloj, batería, cinta, cordura.</w:t>
-      </w:r>
-    </w:p>
-    <w:p>
-      <w:pPr>
-        <w:pStyle w:val="ListParagraph"/>
-        <w:numPr>
-          <w:ilvl w:val="0"/>
-          <w:numId w:val="14"/>
-        </w:numPr>
-      </w:pPr>
-      <w:r>
-        <w:t xml:space="preserve">☐ Escena </w:t>
-      </w:r>
-      <w:r>
-        <w:rPr>
-          <w:rStyle w:val="CodeChar"/>
-        </w:rPr>
-        <w:t xml:space="preserve">Bootstrap</w:t>
-      </w:r>
-      <w:r>
-        <w:t xml:space="preserve"> → </w:t>
-      </w:r>
-      <w:r>
-        <w:rPr>
-          <w:rStyle w:val="CodeChar"/>
-        </w:rPr>
-        <w:t xml:space="preserve">Lobby</w:t>
-      </w:r>
-      <w:r>
-        <w:t xml:space="preserve"> → </w:t>
-      </w:r>
-      <w:r>
-        <w:rPr>
-          <w:rStyle w:val="CodeChar"/>
-        </w:rPr>
-        <w:t xml:space="preserve">Mansion</w:t>
-      </w:r>
-      <w:r>
-        <w:t xml:space="preserve">.</w:t>
+        <w:t xml:space="preserve"> hasta que dure 2.5–3.5 h.</w:t>
+      </w:r>
+    </w:p>
+    <w:p>
+      <w:pPr>
+        <w:pStyle w:val="ListParagraph"/>
+        <w:numPr>
+          <w:ilvl w:val="0"/>
+          <w:numId w:val="22"/>
+        </w:numPr>
+      </w:pPr>
+      <w:r>
+        <w:t xml:space="preserve">☐ Corregir los errores más graves de la lista de pruebas.</w:t>
       </w:r>
     </w:p>
     <w:p>
@@ -2369,148 +3261,43 @@
         <w:pStyle w:val="Heading2"/>
       </w:pPr>
       <w:r>
-        <w:t xml:space="preserve">Fase 1 — Jugador y camcorder en solitario (días 3–7)</w:t>
-      </w:r>
-    </w:p>
-    <w:p>
-      <w:pPr>
-        <w:pStyle w:val="ListParagraph"/>
-        <w:numPr>
-          <w:ilvl w:val="0"/>
-          <w:numId w:val="15"/>
-        </w:numPr>
-      </w:pPr>
-      <w:r>
-        <w:t xml:space="preserve">☐ Controlador en primera persona: caminar, correr (con stamina), agacharse, mirar con ratón.</w:t>
-      </w:r>
-    </w:p>
-    <w:p>
-      <w:pPr>
-        <w:pStyle w:val="ListParagraph"/>
-        <w:numPr>
-          <w:ilvl w:val="0"/>
-          <w:numId w:val="15"/>
-        </w:numPr>
-      </w:pPr>
-      <w:r>
-        <w:t xml:space="preserve">☐ Cámara del jugador con overlay de camcorder: luz REC parpadeante, tiempo, batería, cinta.</w:t>
-      </w:r>
-    </w:p>
-    <w:p>
-      <w:pPr>
-        <w:pStyle w:val="ListParagraph"/>
-        <w:numPr>
-          <w:ilvl w:val="0"/>
-          <w:numId w:val="15"/>
-        </w:numPr>
-      </w:pPr>
-      <w:r>
-        <w:t xml:space="preserve">☐ Postprocesado found footage: grano, viñeta, aberración cromática, ruido.</w:t>
-      </w:r>
-    </w:p>
-    <w:p>
-      <w:pPr>
-        <w:pStyle w:val="ListParagraph"/>
-        <w:numPr>
-          <w:ilvl w:val="0"/>
-          <w:numId w:val="15"/>
-        </w:numPr>
-      </w:pPr>
-      <w:r>
-        <w:t xml:space="preserve">☐ Visión nocturna (tecla N) con consumo de batería 3×.</w:t>
-      </w:r>
-    </w:p>
-    <w:p>
-      <w:pPr>
-        <w:pStyle w:val="ListParagraph"/>
-        <w:numPr>
-          <w:ilvl w:val="0"/>
-          <w:numId w:val="15"/>
-        </w:numPr>
-      </w:pPr>
-      <w:r>
-        <w:t xml:space="preserve">☐ Zoom con la rueda del ratón.</w:t>
-      </w:r>
-    </w:p>
-    <w:p>
-      <w:pPr>
-        <w:pStyle w:val="ListParagraph"/>
-        <w:numPr>
-          <w:ilvl w:val="0"/>
-          <w:numId w:val="15"/>
-        </w:numPr>
-      </w:pPr>
-      <w:r>
-        <w:t xml:space="preserve">☐ Batería y cinta que se agotan, con avisos y apagado de la cámara a 0.</w:t>
-      </w:r>
-    </w:p>
-    <w:p>
-      <w:pPr>
-        <w:pStyle w:val="ListParagraph"/>
-        <w:numPr>
-          <w:ilvl w:val="0"/>
-          <w:numId w:val="15"/>
-        </w:numPr>
-      </w:pPr>
-      <w:r>
-        <w:t xml:space="preserve">☐ Linterna independiente de la cámara.</w:t>
-      </w:r>
-    </w:p>
-    <w:p>
-      <w:pPr>
-        <w:pStyle w:val="ListParagraph"/>
-        <w:numPr>
-          <w:ilvl w:val="0"/>
-          <w:numId w:val="15"/>
-        </w:numPr>
-      </w:pPr>
-      <w:r>
-        <w:t xml:space="preserve">☐ Sistema de interacción (tecla E): abrir puertas, recoger objetos, usar interruptores.</w:t>
-      </w:r>
-    </w:p>
-    <w:p>
-      <w:pPr>
-        <w:pStyle w:val="ListParagraph"/>
-        <w:numPr>
-          <w:ilvl w:val="0"/>
-          <w:numId w:val="15"/>
-        </w:numPr>
-      </w:pPr>
-      <w:r>
-        <w:t xml:space="preserve">☐ Inventario simple de 3 ranuras más camcorder.</w:t>
-      </w:r>
-    </w:p>
-    <w:p>
-      <w:pPr>
-        <w:pStyle w:val="ListParagraph"/>
-        <w:numPr>
-          <w:ilvl w:val="0"/>
-          <w:numId w:val="15"/>
-        </w:numPr>
-      </w:pPr>
-      <w:r>
-        <w:t xml:space="preserve">☐ Capa «Ghost» visible solo para la cámara del jugador (culling mask). Probar con un cubo de prueba.</w:t>
-      </w:r>
-    </w:p>
-    <w:p>
-      <w:pPr>
-        <w:pStyle w:val="ListParagraph"/>
-        <w:numPr>
-          <w:ilvl w:val="0"/>
-          <w:numId w:val="15"/>
-        </w:numPr>
-      </w:pPr>
-      <w:r>
-        <w:t xml:space="preserve">☐ </w:t>
-      </w:r>
-      <w:r>
-        <w:rPr>
-          <w:b/>
-        </w:rPr>
-        <w:t xml:space="preserve">Prueba:</w:t>
-      </w:r>
-      <w:r>
-        <w:t xml:space="preserve"> recorrer una sala de prueba, ver el cubo solo por la cámara, gastar batería y cinta.</w:t>
+        <w:t xml:space="preserve">Fase 7 — Entrega (días 29–30)</w:t>
+      </w:r>
+    </w:p>
+    <w:p>
+      <w:pPr>
+        <w:pStyle w:val="ListParagraph"/>
+        <w:numPr>
+          <w:ilvl w:val="0"/>
+          <w:numId w:val="23"/>
+        </w:numPr>
+      </w:pPr>
+      <w:r>
+        <w:t xml:space="preserve">☐ Build para Windows.</w:t>
+      </w:r>
+    </w:p>
+    <w:p>
+      <w:pPr>
+        <w:pStyle w:val="ListParagraph"/>
+        <w:numPr>
+          <w:ilvl w:val="0"/>
+          <w:numId w:val="23"/>
+        </w:numPr>
+      </w:pPr>
+      <w:r>
+        <w:t xml:space="preserve">☐ Prueba final con 3–4 amigos en red real.</w:t>
+      </w:r>
+    </w:p>
+    <w:p>
+      <w:pPr>
+        <w:pStyle w:val="ListParagraph"/>
+        <w:numPr>
+          <w:ilvl w:val="0"/>
+          <w:numId w:val="23"/>
+        </w:numPr>
+      </w:pPr>
+      <w:r>
+        <w:t xml:space="preserve">☐ Lista de errores conocidos y mejoras para la v2.</w:t>
       </w:r>
     </w:p>
     <w:p>
@@ -2518,669 +3305,6 @@
         <w:pStyle w:val="Heading2"/>
       </w:pPr>
       <w:r>
-        <w:t xml:space="preserve">Fase 2 — Mansión (días 6–12)</w:t>
-      </w:r>
-    </w:p>
-    <w:p>
-      <w:pPr>
-        <w:pStyle w:val="ListParagraph"/>
-        <w:numPr>
-          <w:ilvl w:val="0"/>
-          <w:numId w:val="16"/>
-        </w:numPr>
-      </w:pPr>
-      <w:r>
-        <w:t xml:space="preserve">☐ Construir la mansión por bloques (modular) con assets de la Asset Store y objetos de Hunyuan3D: sótano, planta baja, primer piso, exterior con la camioneta.</w:t>
-      </w:r>
-    </w:p>
-    <w:p>
-      <w:pPr>
-        <w:pStyle w:val="ListParagraph"/>
-        <w:numPr>
-          <w:ilvl w:val="0"/>
-          <w:numId w:val="16"/>
-        </w:numPr>
-      </w:pPr>
-      <w:r>
-        <w:t xml:space="preserve">☐ Iluminación baja, luces que se pueden encender/apagar, generador en el sótano.</w:t>
-      </w:r>
-    </w:p>
-    <w:p>
-      <w:pPr>
-        <w:pStyle w:val="ListParagraph"/>
-        <w:numPr>
-          <w:ilvl w:val="0"/>
-          <w:numId w:val="16"/>
-        </w:numPr>
-      </w:pPr>
-      <w:r>
-        <w:t xml:space="preserve">☐ Puertas con llave y sistema de llaves que desbloquea cada acto.</w:t>
-      </w:r>
-    </w:p>
-    <w:p>
-      <w:pPr>
-        <w:pStyle w:val="ListParagraph"/>
-        <w:numPr>
-          <w:ilvl w:val="0"/>
-          <w:numId w:val="16"/>
-        </w:numPr>
-      </w:pPr>
-      <w:r>
-        <w:t xml:space="preserve">☐ Escondites (armarios y camas) que el jugador puede usar.</w:t>
-      </w:r>
-    </w:p>
-    <w:p>
-      <w:pPr>
-        <w:pStyle w:val="ListParagraph"/>
-        <w:numPr>
-          <w:ilvl w:val="0"/>
-          <w:numId w:val="16"/>
-        </w:numPr>
-      </w:pPr>
-      <w:r>
-        <w:t xml:space="preserve">☐ Bake de NavMesh en toda la casa.</w:t>
-      </w:r>
-    </w:p>
-    <w:p>
-      <w:pPr>
-        <w:pStyle w:val="ListParagraph"/>
-        <w:numPr>
-          <w:ilvl w:val="0"/>
-          <w:numId w:val="16"/>
-        </w:numPr>
-      </w:pPr>
-      <w:r>
-        <w:t xml:space="preserve">☐ Puntos de interés marcados: sala favorita candidata, puntos de objeto de ritual, puntos de evidencia.</w:t>
-      </w:r>
-    </w:p>
-    <w:p>
-      <w:pPr>
-        <w:pStyle w:val="ListParagraph"/>
-        <w:numPr>
-          <w:ilvl w:val="0"/>
-          <w:numId w:val="16"/>
-        </w:numPr>
-      </w:pPr>
-      <w:r>
-        <w:t xml:space="preserve">☐ </w:t>
-      </w:r>
-      <w:r>
-        <w:rPr>
-          <w:b/>
-        </w:rPr>
-        <w:t xml:space="preserve">Prueba:</w:t>
-      </w:r>
-      <w:r>
-        <w:t xml:space="preserve"> recorrer toda la casa, que las puertas y llaves funcionen, que el NavMesh cubra todo.</w:t>
-      </w:r>
-    </w:p>
-    <w:p>
-      <w:pPr>
-        <w:pStyle w:val="Heading2"/>
-      </w:pPr>
-      <w:r>
-        <w:t xml:space="preserve">Fase 3 — Fantasma, evidencias y diario (días 10–17)</w:t>
-      </w:r>
-    </w:p>
-    <w:p>
-      <w:pPr>
-        <w:pStyle w:val="ListParagraph"/>
-        <w:numPr>
-          <w:ilvl w:val="0"/>
-          <w:numId w:val="17"/>
-        </w:numPr>
-      </w:pPr>
-      <w:r>
-        <w:t xml:space="preserve">☐ ScriptableObject </w:t>
-      </w:r>
-      <w:r>
-        <w:rPr>
-          <w:rStyle w:val="CodeChar"/>
-        </w:rPr>
-        <w:t xml:space="preserve">GhostType</w:t>
-      </w:r>
-      <w:r>
-        <w:t xml:space="preserve"> con: nombre, evidencias, velocidad, comportamiento, objetos de ritual.</w:t>
-      </w:r>
-    </w:p>
-    <w:p>
-      <w:pPr>
-        <w:pStyle w:val="ListParagraph"/>
-        <w:numPr>
-          <w:ilvl w:val="0"/>
-          <w:numId w:val="17"/>
-        </w:numPr>
-      </w:pPr>
-      <w:r>
-        <w:t xml:space="preserve">☐ Crear los 4 fantasmas: Ghoul, Vampiro, Poltergeist, Espectro.</w:t>
-      </w:r>
-    </w:p>
-    <w:p>
-      <w:pPr>
-        <w:pStyle w:val="ListParagraph"/>
-        <w:numPr>
-          <w:ilvl w:val="0"/>
-          <w:numId w:val="17"/>
-        </w:numPr>
-      </w:pPr>
-      <w:r>
-        <w:t xml:space="preserve">☐ IA base con estados: Deambular, Actividad, Cacería, Descanso.</w:t>
-      </w:r>
-    </w:p>
-    <w:p>
-      <w:pPr>
-        <w:pStyle w:val="ListParagraph"/>
-        <w:numPr>
-          <w:ilvl w:val="0"/>
-          <w:numId w:val="17"/>
-        </w:numPr>
-      </w:pPr>
-      <w:r>
-        <w:t xml:space="preserve">☐ Elegir tipo de fantasma, sala favorita y agresividad al iniciar la partida.</w:t>
-      </w:r>
-    </w:p>
-    <w:p>
-      <w:pPr>
-        <w:pStyle w:val="ListParagraph"/>
-        <w:numPr>
-          <w:ilvl w:val="0"/>
-          <w:numId w:val="17"/>
-        </w:numPr>
-      </w:pPr>
-      <w:r>
-        <w:t xml:space="preserve">☐ Comportamientos propios: Ghoul (oído), Vampiro (oscuridad y batería), Poltergeist (objetos), Espectro (paredes y teletransporte).</w:t>
-      </w:r>
-    </w:p>
-    <w:p>
-      <w:pPr>
-        <w:pStyle w:val="ListParagraph"/>
-        <w:numPr>
-          <w:ilvl w:val="0"/>
-          <w:numId w:val="17"/>
-        </w:numPr>
-      </w:pPr>
-      <w:r>
-        <w:t xml:space="preserve">☐ Interferencia en la cámara según distancia al fantasma.</w:t>
-      </w:r>
-    </w:p>
-    <w:p>
-      <w:pPr>
-        <w:pStyle w:val="ListParagraph"/>
-        <w:numPr>
-          <w:ilvl w:val="0"/>
-          <w:numId w:val="17"/>
-        </w:numPr>
-      </w:pPr>
-      <w:r>
-        <w:t xml:space="preserve">☐ Sistema de cacería: 45–90 s, luces que se apagan, estática en la cámara, jugador atrapado muere.</w:t>
-      </w:r>
-    </w:p>
-    <w:p>
-      <w:pPr>
-        <w:pStyle w:val="ListParagraph"/>
-        <w:numPr>
-          <w:ilvl w:val="0"/>
-          <w:numId w:val="17"/>
-        </w:numPr>
-      </w:pPr>
-      <w:r>
-        <w:t xml:space="preserve">☐ Las 5 evidencias: aparición, EMF, termómetro, libro de escritura, orbes.</w:t>
-      </w:r>
-    </w:p>
-    <w:p>
-      <w:pPr>
-        <w:pStyle w:val="ListParagraph"/>
-        <w:numPr>
-          <w:ilvl w:val="0"/>
-          <w:numId w:val="17"/>
-        </w:numPr>
-      </w:pPr>
-      <w:r>
-        <w:t xml:space="preserve">☐ Diario compartido: marcar evidencias, filtrar fantasmas posibles, elegir uno.</w:t>
-      </w:r>
-    </w:p>
-    <w:p>
-      <w:pPr>
-        <w:pStyle w:val="ListParagraph"/>
-        <w:numPr>
-          <w:ilvl w:val="0"/>
-          <w:numId w:val="17"/>
-        </w:numPr>
-      </w:pPr>
-      <w:r>
-        <w:t xml:space="preserve">☐ Sistema de cordura con alucinaciones.</w:t>
-      </w:r>
-    </w:p>
-    <w:p>
-      <w:pPr>
-        <w:pStyle w:val="ListParagraph"/>
-        <w:numPr>
-          <w:ilvl w:val="0"/>
-          <w:numId w:val="17"/>
-        </w:numPr>
-      </w:pPr>
-      <w:r>
-        <w:t xml:space="preserve">☐ Modo espectador al morir, con parpadeo de luces.</w:t>
-      </w:r>
-    </w:p>
-    <w:p>
-      <w:pPr>
-        <w:pStyle w:val="ListParagraph"/>
-        <w:numPr>
-          <w:ilvl w:val="0"/>
-          <w:numId w:val="17"/>
-        </w:numPr>
-      </w:pPr>
-      <w:r>
-        <w:t xml:space="preserve">☐ </w:t>
-      </w:r>
-      <w:r>
-        <w:rPr>
-          <w:b/>
-        </w:rPr>
-        <w:t xml:space="preserve">Prueba:</w:t>
-      </w:r>
-      <w:r>
-        <w:t xml:space="preserve"> forzar cada tipo de fantasma, confirmar que las evidencias coinciden con la tabla del GDD.</w:t>
-      </w:r>
-    </w:p>
-    <w:p>
-      <w:pPr>
-        <w:pStyle w:val="Heading2"/>
-      </w:pPr>
-      <w:r>
-        <w:t xml:space="preserve">Fase 4 — Reloj y ritual (días 15–20)</w:t>
-      </w:r>
-    </w:p>
-    <w:p>
-      <w:pPr>
-        <w:pStyle w:val="ListParagraph"/>
-        <w:numPr>
-          <w:ilvl w:val="0"/>
-          <w:numId w:val="18"/>
-        </w:numPr>
-      </w:pPr>
-      <w:r>
-        <w:t xml:space="preserve">☐ Reloj de la noche (22:00–06:00) configurable desde </w:t>
-      </w:r>
-      <w:r>
-        <w:rPr>
-          <w:rStyle w:val="CodeChar"/>
-        </w:rPr>
-        <w:t xml:space="preserve">GameConfig</w:t>
-      </w:r>
-      <w:r>
-        <w:t xml:space="preserve">.</w:t>
-      </w:r>
-    </w:p>
-    <w:p>
-      <w:pPr>
-        <w:pStyle w:val="ListParagraph"/>
-        <w:numPr>
-          <w:ilvl w:val="0"/>
-          <w:numId w:val="18"/>
-        </w:numPr>
-      </w:pPr>
-      <w:r>
-        <w:t xml:space="preserve">☐ Cambio de actos según la hora, con desbloqueo de áreas.</w:t>
-      </w:r>
-    </w:p>
-    <w:p>
-      <w:pPr>
-        <w:pStyle w:val="ListParagraph"/>
-        <w:numPr>
-          <w:ilvl w:val="0"/>
-          <w:numId w:val="18"/>
-        </w:numPr>
-      </w:pPr>
-      <w:r>
-        <w:t xml:space="preserve">☐ Objetos de ritual (3 por tipo de fantasma) colocados al azar en puntos válidos.</w:t>
-      </w:r>
-    </w:p>
-    <w:p>
-      <w:pPr>
-        <w:pStyle w:val="ListParagraph"/>
-        <w:numPr>
-          <w:ilvl w:val="0"/>
-          <w:numId w:val="18"/>
-        </w:numPr>
-      </w:pPr>
-      <w:r>
-        <w:t xml:space="preserve">☐ Sala del ritual con el círculo: colocar objetos, encender velas.</w:t>
-      </w:r>
-    </w:p>
-    <w:p>
-      <w:pPr>
-        <w:pStyle w:val="ListParagraph"/>
-        <w:numPr>
-          <w:ilvl w:val="0"/>
-          <w:numId w:val="18"/>
-        </w:numPr>
-      </w:pPr>
-      <w:r>
-        <w:t xml:space="preserve">☐ Ritual en 3 oleadas con cacerías cada vez más fuertes.</w:t>
-      </w:r>
-    </w:p>
-    <w:p>
-      <w:pPr>
-        <w:pStyle w:val="ListParagraph"/>
-        <w:numPr>
-          <w:ilvl w:val="0"/>
-          <w:numId w:val="18"/>
-        </w:numPr>
-      </w:pPr>
-      <w:r>
-        <w:t xml:space="preserve">☐ Si el diario fue correcto: expulsión y victoria. Si no: el ritual falla y el fantasma se enfurece.</w:t>
-      </w:r>
-    </w:p>
-    <w:p>
-      <w:pPr>
-        <w:pStyle w:val="ListParagraph"/>
-        <w:numPr>
-          <w:ilvl w:val="0"/>
-          <w:numId w:val="18"/>
-        </w:numPr>
-      </w:pPr>
-      <w:r>
-        <w:t xml:space="preserve">☐ Pantallas de victoria, derrota por amanecer y derrota por muerte total.</w:t>
-      </w:r>
-    </w:p>
-    <w:p>
-      <w:pPr>
-        <w:pStyle w:val="ListParagraph"/>
-        <w:numPr>
-          <w:ilvl w:val="0"/>
-          <w:numId w:val="18"/>
-        </w:numPr>
-      </w:pPr>
-      <w:r>
-        <w:t xml:space="preserve">☐ </w:t>
-      </w:r>
-      <w:r>
-        <w:rPr>
-          <w:b/>
-        </w:rPr>
-        <w:t xml:space="preserve">Prueba:</w:t>
-      </w:r>
-      <w:r>
-        <w:t xml:space="preserve"> una partida completa solo, de principio a fin, con el reloj acelerado.</w:t>
-      </w:r>
-    </w:p>
-    <w:p>
-      <w:pPr>
-        <w:pStyle w:val="Heading2"/>
-      </w:pPr>
-      <w:r>
-        <w:t xml:space="preserve">Fase 5 — Multijugador (días 18–25)</w:t>
-      </w:r>
-    </w:p>
-    <w:p>
-      <w:pPr>
-        <w:pStyle w:val="ListParagraph"/>
-        <w:numPr>
-          <w:ilvl w:val="0"/>
-          <w:numId w:val="19"/>
-        </w:numPr>
-      </w:pPr>
-      <w:r>
-        <w:t xml:space="preserve">☐ Pantalla de lobby: crear sala con un nombre y unirse por nombre de sala.</w:t>
-      </w:r>
-    </w:p>
-    <w:p>
-      <w:pPr>
-        <w:pStyle w:val="ListParagraph"/>
-        <w:numPr>
-          <w:ilvl w:val="0"/>
-          <w:numId w:val="19"/>
-        </w:numPr>
-      </w:pPr>
-      <w:r>
-        <w:t xml:space="preserve">☐ Conexión con Photon Fusion 2 en Shared Mode; spawn de hasta 4 jugadores.</w:t>
-      </w:r>
-    </w:p>
-    <w:p>
-      <w:pPr>
-        <w:pStyle w:val="ListParagraph"/>
-        <w:numPr>
-          <w:ilvl w:val="0"/>
-          <w:numId w:val="19"/>
-        </w:numPr>
-      </w:pPr>
-      <w:r>
-        <w:t xml:space="preserve">☐ Sincronizar jugadores: posición, animación, linterna, estado de cámara.</w:t>
-      </w:r>
-    </w:p>
-    <w:p>
-      <w:pPr>
-        <w:pStyle w:val="ListParagraph"/>
-        <w:numPr>
-          <w:ilvl w:val="0"/>
-          <w:numId w:val="19"/>
-        </w:numPr>
-      </w:pPr>
-      <w:r>
-        <w:t xml:space="preserve">☐ Dar al creador de la sala la autoridad sobre la IA del fantasma y el reloj, y pasarla a otro jugador si se desconecta.</w:t>
-      </w:r>
-    </w:p>
-    <w:p>
-      <w:pPr>
-        <w:pStyle w:val="ListParagraph"/>
-        <w:numPr>
-          <w:ilvl w:val="0"/>
-          <w:numId w:val="19"/>
-        </w:numPr>
-      </w:pPr>
-      <w:r>
-        <w:t xml:space="preserve">☐ Sincronizar puertas, luces, objetos recogidos, evidencias y diario.</w:t>
-      </w:r>
-    </w:p>
-    <w:p>
-      <w:pPr>
-        <w:pStyle w:val="ListParagraph"/>
-        <w:numPr>
-          <w:ilvl w:val="0"/>
-          <w:numId w:val="19"/>
-        </w:numPr>
-      </w:pPr>
-      <w:r>
-        <w:t xml:space="preserve">☐ Capa fantasma local por jugador según su cámara.</w:t>
-      </w:r>
-    </w:p>
-    <w:p>
-      <w:pPr>
-        <w:pStyle w:val="ListParagraph"/>
-        <w:numPr>
-          <w:ilvl w:val="0"/>
-          <w:numId w:val="19"/>
-        </w:numPr>
-      </w:pPr>
-      <w:r>
-        <w:t xml:space="preserve">☐ Manejo de desconexiones: el fantasma sigue y el jugador queda como muerto.</w:t>
-      </w:r>
-    </w:p>
-    <w:p>
-      <w:pPr>
-        <w:pStyle w:val="ListParagraph"/>
-        <w:numPr>
-          <w:ilvl w:val="0"/>
-          <w:numId w:val="19"/>
-        </w:numPr>
-      </w:pPr>
-      <w:r>
-        <w:t xml:space="preserve">☐ Bloquear el diario para que cualquiera pueda marcar pero se actualice para todos.</w:t>
-      </w:r>
-    </w:p>
-    <w:p>
-      <w:pPr>
-        <w:pStyle w:val="ListParagraph"/>
-        <w:numPr>
-          <w:ilvl w:val="0"/>
-          <w:numId w:val="19"/>
-        </w:numPr>
-      </w:pPr>
-      <w:r>
-        <w:t xml:space="preserve">☐ </w:t>
-      </w:r>
-      <w:r>
-        <w:rPr>
-          <w:b/>
-        </w:rPr>
-        <w:t xml:space="preserve">Prueba:</w:t>
-      </w:r>
-      <w:r>
-        <w:t xml:space="preserve"> dos instancias en la misma PC, luego dos PCs distintas con Photon.</w:t>
-      </w:r>
-    </w:p>
-    <w:p>
-      <w:pPr>
-        <w:pStyle w:val="Heading2"/>
-      </w:pPr>
-      <w:r>
-        <w:t xml:space="preserve">Fase 6 — Audio, pulido y balance (días 24–29)</w:t>
-      </w:r>
-    </w:p>
-    <w:p>
-      <w:pPr>
-        <w:pStyle w:val="ListParagraph"/>
-        <w:numPr>
-          <w:ilvl w:val="0"/>
-          <w:numId w:val="20"/>
-        </w:numPr>
-      </w:pPr>
-      <w:r>
-        <w:t xml:space="preserve">☐ Audio 3D: pasos, puertas, voz del fantasma, latidos según miedo.</w:t>
-      </w:r>
-    </w:p>
-    <w:p>
-      <w:pPr>
-        <w:pStyle w:val="ListParagraph"/>
-        <w:numPr>
-          <w:ilvl w:val="0"/>
-          <w:numId w:val="20"/>
-        </w:numPr>
-      </w:pPr>
-      <w:r>
-        <w:t xml:space="preserve">☐ Sonido distinto por cada fantasma y por cada fase de cacería.</w:t>
-      </w:r>
-    </w:p>
-    <w:p>
-      <w:pPr>
-        <w:pStyle w:val="ListParagraph"/>
-        <w:numPr>
-          <w:ilvl w:val="0"/>
-          <w:numId w:val="20"/>
-        </w:numPr>
-      </w:pPr>
-      <w:r>
-        <w:t xml:space="preserve">☐ Efectos visuales de la cámara según la interferencia.</w:t>
-      </w:r>
-    </w:p>
-    <w:p>
-      <w:pPr>
-        <w:pStyle w:val="ListParagraph"/>
-        <w:numPr>
-          <w:ilvl w:val="0"/>
-          <w:numId w:val="20"/>
-        </w:numPr>
-      </w:pPr>
-      <w:r>
-        <w:t xml:space="preserve">☐ Menú principal, pausa y ajustes (volumen, sensibilidad, subtítulos).</w:t>
-      </w:r>
-    </w:p>
-    <w:p>
-      <w:pPr>
-        <w:pStyle w:val="ListParagraph"/>
-        <w:numPr>
-          <w:ilvl w:val="0"/>
-          <w:numId w:val="20"/>
-        </w:numPr>
-      </w:pPr>
-      <w:r>
-        <w:t xml:space="preserve">☐ Tutorial corto en la camioneta: cómo usar cámara, diario y herramientas.</w:t>
-      </w:r>
-    </w:p>
-    <w:p>
-      <w:pPr>
-        <w:pStyle w:val="ListParagraph"/>
-        <w:numPr>
-          <w:ilvl w:val="0"/>
-          <w:numId w:val="20"/>
-        </w:numPr>
-      </w:pPr>
-      <w:r>
-        <w:t xml:space="preserve">☐ Pasada de balance: probar 5 partidas completas y ajustar </w:t>
-      </w:r>
-      <w:r>
-        <w:rPr>
-          <w:rStyle w:val="CodeChar"/>
-        </w:rPr>
-        <w:t xml:space="preserve">GameConfig</w:t>
-      </w:r>
-      <w:r>
-        <w:t xml:space="preserve"> hasta que dure 2.5–3.5 h.</w:t>
-      </w:r>
-    </w:p>
-    <w:p>
-      <w:pPr>
-        <w:pStyle w:val="ListParagraph"/>
-        <w:numPr>
-          <w:ilvl w:val="0"/>
-          <w:numId w:val="20"/>
-        </w:numPr>
-      </w:pPr>
-      <w:r>
-        <w:t xml:space="preserve">☐ Corregir los errores más graves de la lista de pruebas.</w:t>
-      </w:r>
-    </w:p>
-    <w:p>
-      <w:pPr>
-        <w:pStyle w:val="Heading2"/>
-      </w:pPr>
-      <w:r>
-        <w:t xml:space="preserve">Fase 7 — Entrega (días 29–30)</w:t>
-      </w:r>
-    </w:p>
-    <w:p>
-      <w:pPr>
-        <w:pStyle w:val="ListParagraph"/>
-        <w:numPr>
-          <w:ilvl w:val="0"/>
-          <w:numId w:val="21"/>
-        </w:numPr>
-      </w:pPr>
-      <w:r>
-        <w:t xml:space="preserve">☐ Build para Windows.</w:t>
-      </w:r>
-    </w:p>
-    <w:p>
-      <w:pPr>
-        <w:pStyle w:val="ListParagraph"/>
-        <w:numPr>
-          <w:ilvl w:val="0"/>
-          <w:numId w:val="21"/>
-        </w:numPr>
-      </w:pPr>
-      <w:r>
-        <w:t xml:space="preserve">☐ Prueba final con 3–4 amigos en red real.</w:t>
-      </w:r>
-    </w:p>
-    <w:p>
-      <w:pPr>
-        <w:pStyle w:val="ListParagraph"/>
-        <w:numPr>
-          <w:ilvl w:val="0"/>
-          <w:numId w:val="21"/>
-        </w:numPr>
-      </w:pPr>
-      <w:r>
-        <w:t xml:space="preserve">☐ Lista de errores conocidos y mejoras para la v2.</w:t>
-      </w:r>
-    </w:p>
-    <w:p>
-      <w:pPr>
-        <w:pStyle w:val="Heading2"/>
-      </w:pPr>
-      <w:r>
         <w:t xml:space="preserve">Definición de «terminado»</w:t>
       </w:r>
     </w:p>
@@ -3189,7 +3313,7 @@
         <w:pStyle w:val="ListParagraph"/>
         <w:numPr>
           <w:ilvl w:val="0"/>
-          <w:numId w:val="22"/>
+          <w:numId w:val="24"/>
         </w:numPr>
       </w:pPr>
       <w:r>
@@ -3201,7 +3325,7 @@
         <w:pStyle w:val="ListParagraph"/>
         <w:numPr>
           <w:ilvl w:val="0"/>
-          <w:numId w:val="22"/>
+          <w:numId w:val="24"/>
         </w:numPr>
       </w:pPr>
       <w:r>
@@ -3213,7 +3337,7 @@
         <w:pStyle w:val="ListParagraph"/>
         <w:numPr>
           <w:ilvl w:val="0"/>
-          <w:numId w:val="22"/>
+          <w:numId w:val="24"/>
         </w:numPr>
       </w:pPr>
       <w:r>
@@ -3225,7 +3349,7 @@
         <w:pStyle w:val="ListParagraph"/>
         <w:numPr>
           <w:ilvl w:val="0"/>
-          <w:numId w:val="22"/>
+          <w:numId w:val="24"/>
         </w:numPr>
       </w:pPr>
       <w:r>
@@ -3237,7 +3361,7 @@
         <w:pStyle w:val="ListParagraph"/>
         <w:numPr>
           <w:ilvl w:val="0"/>
-          <w:numId w:val="22"/>
+          <w:numId w:val="24"/>
         </w:numPr>
       </w:pPr>
       <w:r>
@@ -3494,6 +3618,12 @@
   <w:num w:numId="22">
     <w:abstractNumId w:val="0"/>
   </w:num>
+  <w:num w:numId="23">
+    <w:abstractNumId w:val="0"/>
+  </w:num>
+  <w:num w:numId="24">
+    <w:abstractNumId w:val="0"/>
+  </w:num>
 </w:numbering>
 </file>
 
@@ -3530,7 +3660,9 @@
     </w:pPr>
     <w:rPr>
       <w:b/>
+      <w:bCs/>
       <w:sz w:val="32"/>
+      <w:szCs w:val="32"/>
     </w:rPr>
   </w:style>
   <w:style w:type="paragraph" w:styleId="Heading2">
@@ -3545,7 +3677,9 @@
     </w:pPr>
     <w:rPr>
       <w:b/>
+      <w:bCs/>
       <w:sz w:val="26"/>
+      <w:szCs w:val="26"/>
     </w:rPr>
   </w:style>
   <w:style w:type="paragraph" w:styleId="Heading3">
@@ -3560,7 +3694,9 @@
     </w:pPr>
     <w:rPr>
       <w:b/>
+      <w:bCs/>
       <w:sz w:val="24"/>
+      <w:szCs w:val="24"/>
     </w:rPr>
   </w:style>
   <w:style w:type="paragraph" w:styleId="Heading4">
@@ -3574,7 +3710,9 @@
     </w:pPr>
     <w:rPr>
       <w:b/>
+      <w:bCs/>
       <w:sz w:val="22"/>
+      <w:szCs w:val="22"/>
     </w:rPr>
   </w:style>
   <w:style w:type="paragraph" w:styleId="Heading5">
@@ -3588,7 +3726,9 @@
     </w:pPr>
     <w:rPr>
       <w:b/>
+      <w:bCs/>
       <w:sz w:val="22"/>
+      <w:szCs w:val="22"/>
     </w:rPr>
   </w:style>
   <w:style w:type="paragraph" w:styleId="Heading6">
@@ -3602,7 +3742,9 @@
     </w:pPr>
     <w:rPr>
       <w:i/>
+      <w:iCs/>
       <w:sz w:val="22"/>
+      <w:szCs w:val="22"/>
     </w:rPr>
   </w:style>
   <w:style w:type="paragraph" w:styleId="Title">
@@ -3616,6 +3758,7 @@
     </w:pPr>
     <w:rPr>
       <w:sz w:val="56"/>
+      <w:szCs w:val="56"/>
     </w:rPr>
   </w:style>
   <w:style w:type="paragraph" w:styleId="Quote">
@@ -3630,6 +3773,7 @@
     </w:pPr>
     <w:rPr>
       <w:i/>
+      <w:iCs/>
       <w:color w:val="404040"/>
     </w:rPr>
   </w:style>
@@ -3645,6 +3789,7 @@
     <w:rPr>
       <w:rFonts w:ascii="Consolas" w:hAnsi="Consolas" w:eastAsia="Consolas" w:cs="Consolas"/>
       <w:sz w:val="20"/>
+      <w:szCs w:val="20"/>
     </w:rPr>
   </w:style>
   <w:style w:type="character" w:styleId="CodeChar">
@@ -3653,6 +3798,7 @@
     <w:rPr>
       <w:rFonts w:ascii="Consolas" w:hAnsi="Consolas" w:eastAsia="Consolas" w:cs="Consolas"/>
       <w:sz w:val="20"/>
+      <w:szCs w:val="20"/>
       <w:shd w:val="clear" w:color="auto" w:fill="F5F5F5"/>
     </w:rPr>
   </w:style>

</xml_diff>